<commit_message>
Update Newspaper Endorsement Archive Description.docx
</commit_message>
<xml_diff>
--- a/Project Documentation/Newspaper Endorsement Archive Description.docx
+++ b/Project Documentation/Newspaper Endorsement Archive Description.docx
@@ -195,7 +195,63 @@
         <w:rPr>
           <w:color w:val="0E0E0E"/>
         </w:rPr>
-        <w:t>: Kevin DeLuca, Jim Snyder, Tyler Simko, David Beavers, Grace Aitken, Andrew Beingessner, Mary Fahy, Will Forbes, Sabrina Goldfischer, Khuan-Yu Hall, Owen Hannon, Patricia Hughes, Sasha Jones, Zoe Kava, Natasha Khazzam, Matthew Kind, Marina Legoretta, Julia Lin, Emily Mao, Nat Markey, William Porayouw, Alexandra Schoettler, Evan Sun, and Karen Yang.</w:t>
+        <w:t xml:space="preserve">: Kevin DeLuca, Jim Snyder, Tyler Simko, David Beavers, Grace Aitken, Andrew </w:t>
+      </w:r>
+      <w:proofErr w:type="spellStart"/>
+      <w:r>
+        <w:rPr>
+          <w:color w:val="0E0E0E"/>
+        </w:rPr>
+        <w:t>Beingessner</w:t>
+      </w:r>
+      <w:proofErr w:type="spellEnd"/>
+      <w:r>
+        <w:rPr>
+          <w:color w:val="0E0E0E"/>
+        </w:rPr>
+        <w:t xml:space="preserve">, Mary Fahy, Will Forbes, Sabrina Goldfischer, Khuan-Yu Hall, Owen Hannon, Patricia Hughes, Sasha Jones, Zoe Kava, Natasha </w:t>
+      </w:r>
+      <w:proofErr w:type="spellStart"/>
+      <w:r>
+        <w:rPr>
+          <w:color w:val="0E0E0E"/>
+        </w:rPr>
+        <w:t>Khazzam</w:t>
+      </w:r>
+      <w:proofErr w:type="spellEnd"/>
+      <w:r>
+        <w:rPr>
+          <w:color w:val="0E0E0E"/>
+        </w:rPr>
+        <w:t xml:space="preserve">, Matthew Kind, Marina </w:t>
+      </w:r>
+      <w:proofErr w:type="spellStart"/>
+      <w:r>
+        <w:rPr>
+          <w:color w:val="0E0E0E"/>
+        </w:rPr>
+        <w:t>Legoretta</w:t>
+      </w:r>
+      <w:proofErr w:type="spellEnd"/>
+      <w:r>
+        <w:rPr>
+          <w:color w:val="0E0E0E"/>
+        </w:rPr>
+        <w:t xml:space="preserve">, Julia Lin, Emily Mao, Nat Markey, William </w:t>
+      </w:r>
+      <w:proofErr w:type="spellStart"/>
+      <w:r>
+        <w:rPr>
+          <w:color w:val="0E0E0E"/>
+        </w:rPr>
+        <w:t>Porayouw</w:t>
+      </w:r>
+      <w:proofErr w:type="spellEnd"/>
+      <w:r>
+        <w:rPr>
+          <w:color w:val="0E0E0E"/>
+        </w:rPr>
+        <w:t>, Alexandra Schoettler, Evan Sun, and Karen Yang.</w:t>
       </w:r>
     </w:p>
     <w:p>
@@ -319,11 +375,19 @@
         <w:t xml:space="preserve">The newspaper endorsements are used to estimate both relative candidate quality and newspaper partisan bias. I update this data periodically. You can check for the most up-to-date version (and previous versions) of the data on GitHub: </w:t>
       </w:r>
       <w:hyperlink r:id="rId8" w:history="1">
+        <w:proofErr w:type="spellStart"/>
         <w:r>
           <w:rPr>
             <w:rStyle w:val="Hyperlink"/>
           </w:rPr>
-          <w:t>newspaper_endorsements repository</w:t>
+          <w:t>newspaper_endorsements</w:t>
+        </w:r>
+        <w:proofErr w:type="spellEnd"/>
+        <w:r>
+          <w:rPr>
+            <w:rStyle w:val="Hyperlink"/>
+          </w:rPr>
+          <w:t xml:space="preserve"> repository</w:t>
         </w:r>
       </w:hyperlink>
     </w:p>
@@ -388,18 +452,1665 @@
           <w:rFonts w:ascii="Aptos" w:hAnsi="Aptos"/>
         </w:rPr>
       </w:pPr>
-      <w:r>
+    </w:p>
+    <w:p>
+      <w:pPr>
+        <w:pStyle w:val="p1"/>
         <w:rPr>
           <w:rFonts w:ascii="Aptos" w:hAnsi="Aptos"/>
         </w:rPr>
-        <w:t xml:space="preserve">Codebook documentation: </w:t>
-      </w:r>
+      </w:pPr>
+    </w:p>
+    <w:p>
+      <w:pPr>
+        <w:pBdr>
+          <w:top w:val="nil"/>
+          <w:left w:val="nil"/>
+          <w:bottom w:val="nil"/>
+          <w:right w:val="nil"/>
+          <w:between w:val="nil"/>
+        </w:pBdr>
+        <w:spacing w:before="180" w:after="0" w:line="240" w:lineRule="auto"/>
+        <w:rPr>
+          <w:b/>
+          <w:color w:val="0E0E0E"/>
+        </w:rPr>
+      </w:pPr>
+      <w:r>
+        <w:rPr>
+          <w:b/>
+          <w:color w:val="0E0E0E"/>
+        </w:rPr>
+        <w:lastRenderedPageBreak/>
+        <w:t>Variables – CANDIDATE ENDORSEMENTS</w:t>
+      </w:r>
+    </w:p>
+    <w:p>
+      <w:pPr>
+        <w:numPr>
+          <w:ilvl w:val="0"/>
+          <w:numId w:val="4"/>
+        </w:numPr>
+        <w:pBdr>
+          <w:top w:val="nil"/>
+          <w:left w:val="nil"/>
+          <w:bottom w:val="nil"/>
+          <w:right w:val="nil"/>
+          <w:between w:val="nil"/>
+        </w:pBdr>
+        <w:spacing w:before="180" w:after="0" w:line="240" w:lineRule="auto"/>
+        <w:rPr>
+          <w:color w:val="0E0E0E"/>
+          <w:sz w:val="21"/>
+          <w:szCs w:val="21"/>
+        </w:rPr>
+      </w:pPr>
+      <w:proofErr w:type="spellStart"/>
+      <w:r>
+        <w:rPr>
+          <w:color w:val="0E0E0E"/>
+          <w:sz w:val="21"/>
+          <w:szCs w:val="21"/>
+          <w:u w:val="single"/>
+        </w:rPr>
+        <w:t>state_newspaper</w:t>
+      </w:r>
+      <w:proofErr w:type="spellEnd"/>
+      <w:r>
+        <w:rPr>
+          <w:color w:val="0E0E0E"/>
+          <w:sz w:val="21"/>
+          <w:szCs w:val="21"/>
+        </w:rPr>
+        <w:t>: state where the paper is located (two-letter abbreviation)</w:t>
+      </w:r>
+    </w:p>
+    <w:p>
+      <w:pPr>
+        <w:numPr>
+          <w:ilvl w:val="0"/>
+          <w:numId w:val="4"/>
+        </w:numPr>
+        <w:pBdr>
+          <w:top w:val="nil"/>
+          <w:left w:val="nil"/>
+          <w:bottom w:val="nil"/>
+          <w:right w:val="nil"/>
+          <w:between w:val="nil"/>
+        </w:pBdr>
+        <w:spacing w:before="180" w:after="0" w:line="240" w:lineRule="auto"/>
+        <w:rPr>
+          <w:color w:val="0E0E0E"/>
+          <w:sz w:val="21"/>
+          <w:szCs w:val="21"/>
+        </w:rPr>
+      </w:pPr>
+      <w:r>
+        <w:rPr>
+          <w:color w:val="0E0E0E"/>
+          <w:sz w:val="21"/>
+          <w:szCs w:val="21"/>
+          <w:u w:val="single"/>
+        </w:rPr>
+        <w:t>newspaper</w:t>
+      </w:r>
+      <w:r>
+        <w:rPr>
+          <w:color w:val="0E0E0E"/>
+          <w:sz w:val="21"/>
+          <w:szCs w:val="21"/>
+        </w:rPr>
+        <w:t>: name of newspaper</w:t>
+      </w:r>
+    </w:p>
+    <w:p>
+      <w:pPr>
+        <w:numPr>
+          <w:ilvl w:val="0"/>
+          <w:numId w:val="4"/>
+        </w:numPr>
+        <w:pBdr>
+          <w:top w:val="nil"/>
+          <w:left w:val="nil"/>
+          <w:bottom w:val="nil"/>
+          <w:right w:val="nil"/>
+          <w:between w:val="nil"/>
+        </w:pBdr>
+        <w:spacing w:before="180" w:after="0" w:line="240" w:lineRule="auto"/>
+        <w:rPr>
+          <w:color w:val="0E0E0E"/>
+          <w:sz w:val="21"/>
+          <w:szCs w:val="21"/>
+        </w:rPr>
+      </w:pPr>
+      <w:proofErr w:type="spellStart"/>
+      <w:r>
+        <w:rPr>
+          <w:color w:val="0E0E0E"/>
+          <w:sz w:val="21"/>
+          <w:szCs w:val="21"/>
+          <w:u w:val="single"/>
+        </w:rPr>
+        <w:t>newspaper_id</w:t>
+      </w:r>
+      <w:proofErr w:type="spellEnd"/>
+      <w:r>
+        <w:rPr>
+          <w:color w:val="0E0E0E"/>
+          <w:sz w:val="21"/>
+          <w:szCs w:val="21"/>
+        </w:rPr>
+        <w:t>: newspaper ID number</w:t>
+      </w:r>
+    </w:p>
+    <w:p>
+      <w:pPr>
+        <w:numPr>
+          <w:ilvl w:val="0"/>
+          <w:numId w:val="4"/>
+        </w:numPr>
+        <w:pBdr>
+          <w:top w:val="nil"/>
+          <w:left w:val="nil"/>
+          <w:bottom w:val="nil"/>
+          <w:right w:val="nil"/>
+          <w:between w:val="nil"/>
+        </w:pBdr>
+        <w:spacing w:before="180" w:after="0" w:line="240" w:lineRule="auto"/>
+        <w:rPr>
+          <w:color w:val="0E0E0E"/>
+          <w:sz w:val="21"/>
+          <w:szCs w:val="21"/>
+        </w:rPr>
+      </w:pPr>
+      <w:r>
+        <w:rPr>
+          <w:color w:val="0E0E0E"/>
+          <w:sz w:val="21"/>
+          <w:szCs w:val="21"/>
+          <w:u w:val="single"/>
+        </w:rPr>
+        <w:t>year</w:t>
+      </w:r>
+      <w:r>
+        <w:rPr>
+          <w:color w:val="0E0E0E"/>
+          <w:sz w:val="21"/>
+          <w:szCs w:val="21"/>
+        </w:rPr>
+        <w:t>: year of election when the endorsement is occurring</w:t>
+      </w:r>
+    </w:p>
+    <w:p>
+      <w:pPr>
+        <w:numPr>
+          <w:ilvl w:val="0"/>
+          <w:numId w:val="4"/>
+        </w:numPr>
+        <w:pBdr>
+          <w:top w:val="nil"/>
+          <w:left w:val="nil"/>
+          <w:bottom w:val="nil"/>
+          <w:right w:val="nil"/>
+          <w:between w:val="nil"/>
+        </w:pBdr>
+        <w:spacing w:before="180" w:after="0" w:line="240" w:lineRule="auto"/>
+        <w:rPr>
+          <w:color w:val="0E0E0E"/>
+          <w:sz w:val="21"/>
+          <w:szCs w:val="21"/>
+        </w:rPr>
+      </w:pPr>
+      <w:r>
+        <w:rPr>
+          <w:color w:val="0E0E0E"/>
+          <w:sz w:val="21"/>
+          <w:szCs w:val="21"/>
+          <w:u w:val="single"/>
+        </w:rPr>
+        <w:t>office</w:t>
+      </w:r>
+      <w:r>
+        <w:rPr>
+          <w:color w:val="0E0E0E"/>
+          <w:sz w:val="21"/>
+          <w:szCs w:val="21"/>
+        </w:rPr>
+        <w:t>: office that is being endorsed</w:t>
+      </w:r>
+    </w:p>
+    <w:p>
+      <w:pPr>
+        <w:numPr>
+          <w:ilvl w:val="0"/>
+          <w:numId w:val="4"/>
+        </w:numPr>
+        <w:pBdr>
+          <w:top w:val="nil"/>
+          <w:left w:val="nil"/>
+          <w:bottom w:val="nil"/>
+          <w:right w:val="nil"/>
+          <w:between w:val="nil"/>
+        </w:pBdr>
+        <w:spacing w:before="180" w:after="0" w:line="240" w:lineRule="auto"/>
+        <w:rPr>
+          <w:color w:val="0E0E0E"/>
+          <w:sz w:val="21"/>
+          <w:szCs w:val="21"/>
+        </w:rPr>
+      </w:pPr>
+      <w:proofErr w:type="spellStart"/>
+      <w:r>
+        <w:rPr>
+          <w:color w:val="0E0E0E"/>
+          <w:sz w:val="21"/>
+          <w:szCs w:val="21"/>
+          <w:u w:val="single"/>
+        </w:rPr>
+        <w:t>dist</w:t>
+      </w:r>
+      <w:proofErr w:type="spellEnd"/>
+      <w:r>
+        <w:rPr>
+          <w:color w:val="0E0E0E"/>
+          <w:sz w:val="21"/>
+          <w:szCs w:val="21"/>
+        </w:rPr>
+        <w:t>: district number of the office for which the endorsement was made (if applicable)</w:t>
+      </w:r>
+    </w:p>
+    <w:p>
+      <w:pPr>
+        <w:numPr>
+          <w:ilvl w:val="0"/>
+          <w:numId w:val="4"/>
+        </w:numPr>
+        <w:pBdr>
+          <w:top w:val="nil"/>
+          <w:left w:val="nil"/>
+          <w:bottom w:val="nil"/>
+          <w:right w:val="nil"/>
+          <w:between w:val="nil"/>
+        </w:pBdr>
+        <w:spacing w:before="180" w:after="0" w:line="240" w:lineRule="auto"/>
+        <w:rPr>
+          <w:color w:val="0E0E0E"/>
+          <w:sz w:val="21"/>
+          <w:szCs w:val="21"/>
+        </w:rPr>
+      </w:pPr>
+      <w:proofErr w:type="spellStart"/>
+      <w:r>
+        <w:rPr>
+          <w:color w:val="0E0E0E"/>
+          <w:sz w:val="21"/>
+          <w:szCs w:val="21"/>
+          <w:u w:val="single"/>
+        </w:rPr>
+        <w:t>dname</w:t>
+      </w:r>
+      <w:proofErr w:type="spellEnd"/>
+      <w:r>
+        <w:rPr>
+          <w:color w:val="0E0E0E"/>
+          <w:sz w:val="21"/>
+          <w:szCs w:val="21"/>
+        </w:rPr>
+        <w:t>: If the district is just a number, this variable should be the same as the “</w:t>
+      </w:r>
+      <w:proofErr w:type="spellStart"/>
+      <w:r>
+        <w:rPr>
+          <w:color w:val="0E0E0E"/>
+          <w:sz w:val="21"/>
+          <w:szCs w:val="21"/>
+        </w:rPr>
+        <w:t>dist</w:t>
+      </w:r>
+      <w:proofErr w:type="spellEnd"/>
+      <w:r>
+        <w:rPr>
+          <w:color w:val="0E0E0E"/>
+          <w:sz w:val="21"/>
+          <w:szCs w:val="21"/>
+        </w:rPr>
+        <w:t>” variable. For weird district names, like letters or town/city names, you can type the name here. For positions like “County Supervisor”, you should put in county name here.</w:t>
+      </w:r>
+    </w:p>
+    <w:p>
+      <w:pPr>
+        <w:numPr>
+          <w:ilvl w:val="0"/>
+          <w:numId w:val="4"/>
+        </w:numPr>
+        <w:pBdr>
+          <w:top w:val="nil"/>
+          <w:left w:val="nil"/>
+          <w:bottom w:val="nil"/>
+          <w:right w:val="nil"/>
+          <w:between w:val="nil"/>
+        </w:pBdr>
+        <w:spacing w:before="180" w:after="0" w:line="240" w:lineRule="auto"/>
+        <w:rPr>
+          <w:color w:val="0E0E0E"/>
+          <w:sz w:val="21"/>
+          <w:szCs w:val="21"/>
+          <w:u w:val="single"/>
+        </w:rPr>
+      </w:pPr>
+      <w:proofErr w:type="spellStart"/>
+      <w:r>
+        <w:rPr>
+          <w:color w:val="0E0E0E"/>
+          <w:sz w:val="21"/>
+          <w:szCs w:val="21"/>
+          <w:u w:val="single"/>
+        </w:rPr>
+        <w:t>state_election</w:t>
+      </w:r>
+      <w:proofErr w:type="spellEnd"/>
+      <w:r>
+        <w:rPr>
+          <w:color w:val="0E0E0E"/>
+          <w:sz w:val="21"/>
+          <w:szCs w:val="21"/>
+          <w:u w:val="single"/>
+        </w:rPr>
+        <w:t>:</w:t>
+      </w:r>
+      <w:r>
+        <w:rPr>
+          <w:color w:val="0E0E0E"/>
+          <w:sz w:val="21"/>
+          <w:szCs w:val="21"/>
+        </w:rPr>
+        <w:t xml:space="preserve"> state of the office/election. Some papers located in one state will endorse candidates in another state. Usually, this is the same as </w:t>
+      </w:r>
+      <w:proofErr w:type="spellStart"/>
+      <w:r>
+        <w:rPr>
+          <w:color w:val="0E0E0E"/>
+          <w:sz w:val="21"/>
+          <w:szCs w:val="21"/>
+        </w:rPr>
+        <w:t>state_newspaper</w:t>
+      </w:r>
+      <w:proofErr w:type="spellEnd"/>
+      <w:r>
+        <w:rPr>
+          <w:color w:val="0E0E0E"/>
+          <w:sz w:val="21"/>
+          <w:szCs w:val="21"/>
+        </w:rPr>
+        <w:t xml:space="preserve"> but not always. Newspapers will make it clear if it is a cross-state endorsement.</w:t>
+      </w:r>
+      <w:r>
+        <w:rPr>
+          <w:color w:val="0E0E0E"/>
+          <w:sz w:val="21"/>
+          <w:szCs w:val="21"/>
+          <w:u w:val="single"/>
+        </w:rPr>
+        <w:t xml:space="preserve"> </w:t>
+      </w:r>
+    </w:p>
+    <w:p>
+      <w:pPr>
+        <w:numPr>
+          <w:ilvl w:val="0"/>
+          <w:numId w:val="4"/>
+        </w:numPr>
+        <w:pBdr>
+          <w:top w:val="nil"/>
+          <w:left w:val="nil"/>
+          <w:bottom w:val="nil"/>
+          <w:right w:val="nil"/>
+          <w:between w:val="nil"/>
+        </w:pBdr>
+        <w:spacing w:before="180" w:after="0" w:line="240" w:lineRule="auto"/>
+        <w:rPr>
+          <w:color w:val="0E0E0E"/>
+          <w:sz w:val="21"/>
+          <w:szCs w:val="21"/>
+        </w:rPr>
+      </w:pPr>
+      <w:proofErr w:type="spellStart"/>
+      <w:r>
+        <w:rPr>
+          <w:color w:val="0E0E0E"/>
+          <w:sz w:val="21"/>
+          <w:szCs w:val="21"/>
+          <w:u w:val="single"/>
+        </w:rPr>
+        <w:t>cand_name</w:t>
+      </w:r>
+      <w:proofErr w:type="spellEnd"/>
+      <w:r>
+        <w:rPr>
+          <w:color w:val="0E0E0E"/>
+          <w:sz w:val="21"/>
+          <w:szCs w:val="21"/>
+        </w:rPr>
+        <w:t xml:space="preserve">: name of the candidate endorsed. </w:t>
+      </w:r>
+    </w:p>
+    <w:p>
+      <w:pPr>
+        <w:numPr>
+          <w:ilvl w:val="0"/>
+          <w:numId w:val="4"/>
+        </w:numPr>
+        <w:pBdr>
+          <w:top w:val="nil"/>
+          <w:left w:val="nil"/>
+          <w:bottom w:val="nil"/>
+          <w:right w:val="nil"/>
+          <w:between w:val="nil"/>
+        </w:pBdr>
+        <w:spacing w:before="180" w:after="0" w:line="240" w:lineRule="auto"/>
+        <w:rPr>
+          <w:color w:val="0E0E0E"/>
+          <w:sz w:val="21"/>
+          <w:szCs w:val="21"/>
+        </w:rPr>
+      </w:pPr>
+      <w:r>
+        <w:rPr>
+          <w:color w:val="0E0E0E"/>
+          <w:sz w:val="21"/>
+          <w:szCs w:val="21"/>
+          <w:u w:val="single"/>
+        </w:rPr>
+        <w:t>party</w:t>
+      </w:r>
+      <w:r>
+        <w:rPr>
+          <w:color w:val="0E0E0E"/>
+          <w:sz w:val="21"/>
+          <w:szCs w:val="21"/>
+        </w:rPr>
+        <w:t>: party of the candidate being endorsed</w:t>
+      </w:r>
+    </w:p>
+    <w:p>
+      <w:pPr>
+        <w:numPr>
+          <w:ilvl w:val="1"/>
+          <w:numId w:val="4"/>
+        </w:numPr>
+        <w:pBdr>
+          <w:top w:val="nil"/>
+          <w:left w:val="nil"/>
+          <w:bottom w:val="nil"/>
+          <w:right w:val="nil"/>
+          <w:between w:val="nil"/>
+        </w:pBdr>
+        <w:spacing w:before="180" w:after="0" w:line="240" w:lineRule="auto"/>
+        <w:rPr>
+          <w:color w:val="0E0E0E"/>
+          <w:sz w:val="21"/>
+          <w:szCs w:val="21"/>
+        </w:rPr>
+      </w:pPr>
+      <w:r>
+        <w:rPr>
+          <w:color w:val="0E0E0E"/>
+          <w:sz w:val="21"/>
+          <w:szCs w:val="21"/>
+        </w:rPr>
+        <w:t>“D” = Democratic party</w:t>
+      </w:r>
+    </w:p>
+    <w:p>
+      <w:pPr>
+        <w:numPr>
+          <w:ilvl w:val="1"/>
+          <w:numId w:val="4"/>
+        </w:numPr>
+        <w:pBdr>
+          <w:top w:val="nil"/>
+          <w:left w:val="nil"/>
+          <w:bottom w:val="nil"/>
+          <w:right w:val="nil"/>
+          <w:between w:val="nil"/>
+        </w:pBdr>
+        <w:spacing w:before="180" w:after="0" w:line="240" w:lineRule="auto"/>
+        <w:rPr>
+          <w:color w:val="0E0E0E"/>
+          <w:sz w:val="21"/>
+          <w:szCs w:val="21"/>
+        </w:rPr>
+      </w:pPr>
+      <w:r>
+        <w:rPr>
+          <w:color w:val="0E0E0E"/>
+          <w:sz w:val="21"/>
+          <w:szCs w:val="21"/>
+        </w:rPr>
+        <w:t>“R” = Republican party</w:t>
+      </w:r>
+    </w:p>
+    <w:p>
+      <w:pPr>
+        <w:numPr>
+          <w:ilvl w:val="1"/>
+          <w:numId w:val="4"/>
+        </w:numPr>
+        <w:pBdr>
+          <w:top w:val="nil"/>
+          <w:left w:val="nil"/>
+          <w:bottom w:val="nil"/>
+          <w:right w:val="nil"/>
+          <w:between w:val="nil"/>
+        </w:pBdr>
+        <w:spacing w:before="180" w:after="0" w:line="240" w:lineRule="auto"/>
+        <w:rPr>
+          <w:color w:val="0E0E0E"/>
+          <w:sz w:val="21"/>
+          <w:szCs w:val="21"/>
+        </w:rPr>
+      </w:pPr>
+      <w:r>
+        <w:rPr>
+          <w:color w:val="0E0E0E"/>
+          <w:sz w:val="21"/>
+          <w:szCs w:val="21"/>
+        </w:rPr>
+        <w:t>“LBT” = Libertarian party</w:t>
+      </w:r>
+    </w:p>
+    <w:p>
+      <w:pPr>
+        <w:numPr>
+          <w:ilvl w:val="1"/>
+          <w:numId w:val="4"/>
+        </w:numPr>
+        <w:pBdr>
+          <w:top w:val="nil"/>
+          <w:left w:val="nil"/>
+          <w:bottom w:val="nil"/>
+          <w:right w:val="nil"/>
+          <w:between w:val="nil"/>
+        </w:pBdr>
+        <w:spacing w:before="180" w:after="0" w:line="240" w:lineRule="auto"/>
+        <w:rPr>
+          <w:color w:val="0E0E0E"/>
+          <w:sz w:val="21"/>
+          <w:szCs w:val="21"/>
+        </w:rPr>
+      </w:pPr>
+      <w:r>
+        <w:rPr>
+          <w:color w:val="0E0E0E"/>
+          <w:sz w:val="21"/>
+          <w:szCs w:val="21"/>
+        </w:rPr>
+        <w:t>“PROG” = Progressive party</w:t>
+      </w:r>
+    </w:p>
+    <w:p>
+      <w:pPr>
+        <w:numPr>
+          <w:ilvl w:val="1"/>
+          <w:numId w:val="4"/>
+        </w:numPr>
+        <w:pBdr>
+          <w:top w:val="nil"/>
+          <w:left w:val="nil"/>
+          <w:bottom w:val="nil"/>
+          <w:right w:val="nil"/>
+          <w:between w:val="nil"/>
+        </w:pBdr>
+        <w:spacing w:before="180" w:after="0" w:line="240" w:lineRule="auto"/>
+        <w:rPr>
+          <w:color w:val="0E0E0E"/>
+          <w:sz w:val="21"/>
+          <w:szCs w:val="21"/>
+        </w:rPr>
+      </w:pPr>
+      <w:r>
+        <w:rPr>
+          <w:color w:val="0E0E0E"/>
+          <w:sz w:val="21"/>
+          <w:szCs w:val="21"/>
+        </w:rPr>
+        <w:t>“IND” = Independent</w:t>
+      </w:r>
+    </w:p>
+    <w:p>
+      <w:pPr>
+        <w:numPr>
+          <w:ilvl w:val="1"/>
+          <w:numId w:val="4"/>
+        </w:numPr>
+        <w:pBdr>
+          <w:top w:val="nil"/>
+          <w:left w:val="nil"/>
+          <w:bottom w:val="nil"/>
+          <w:right w:val="nil"/>
+          <w:between w:val="nil"/>
+        </w:pBdr>
+        <w:spacing w:before="180" w:after="0" w:line="240" w:lineRule="auto"/>
+        <w:rPr>
+          <w:color w:val="0E0E0E"/>
+          <w:sz w:val="21"/>
+          <w:szCs w:val="21"/>
+        </w:rPr>
+      </w:pPr>
+      <w:r>
+        <w:rPr>
+          <w:color w:val="0E0E0E"/>
+          <w:sz w:val="21"/>
+          <w:szCs w:val="21"/>
+        </w:rPr>
+        <w:t xml:space="preserve">“NP” = Non-partisan race </w:t>
+      </w:r>
+    </w:p>
+    <w:p>
+      <w:pPr>
+        <w:numPr>
+          <w:ilvl w:val="1"/>
+          <w:numId w:val="4"/>
+        </w:numPr>
+        <w:pBdr>
+          <w:top w:val="nil"/>
+          <w:left w:val="nil"/>
+          <w:bottom w:val="nil"/>
+          <w:right w:val="nil"/>
+          <w:between w:val="nil"/>
+        </w:pBdr>
+        <w:spacing w:before="180" w:after="0" w:line="240" w:lineRule="auto"/>
+        <w:rPr>
+          <w:color w:val="0E0E0E"/>
+          <w:sz w:val="21"/>
+          <w:szCs w:val="21"/>
+        </w:rPr>
+      </w:pPr>
+      <w:r>
+        <w:rPr>
+          <w:color w:val="0E0E0E"/>
+          <w:sz w:val="21"/>
+          <w:szCs w:val="21"/>
+        </w:rPr>
+        <w:t>Other scattered codes</w:t>
+      </w:r>
+    </w:p>
+    <w:p>
+      <w:pPr>
+        <w:numPr>
+          <w:ilvl w:val="0"/>
+          <w:numId w:val="4"/>
+        </w:numPr>
+        <w:pBdr>
+          <w:top w:val="nil"/>
+          <w:left w:val="nil"/>
+          <w:bottom w:val="nil"/>
+          <w:right w:val="nil"/>
+          <w:between w:val="nil"/>
+        </w:pBdr>
+        <w:spacing w:before="180" w:after="0" w:line="240" w:lineRule="auto"/>
+        <w:rPr>
+          <w:color w:val="0E0E0E"/>
+          <w:sz w:val="21"/>
+          <w:szCs w:val="21"/>
+        </w:rPr>
+      </w:pPr>
+      <w:r>
+        <w:rPr>
+          <w:color w:val="0E0E0E"/>
+          <w:sz w:val="21"/>
+          <w:szCs w:val="21"/>
+          <w:u w:val="single"/>
+        </w:rPr>
+        <w:t>endorsed</w:t>
+      </w:r>
+      <w:r>
+        <w:rPr>
+          <w:color w:val="0E0E0E"/>
+          <w:sz w:val="21"/>
+          <w:szCs w:val="21"/>
+        </w:rPr>
+        <w:t xml:space="preserve">: endorsed=1 if the candidate is endorsed, endorsed=0 if candidate is NOT endorsed. </w:t>
+      </w:r>
+      <w:r>
+        <w:rPr>
+          <w:color w:val="0E0E0E"/>
+          <w:sz w:val="21"/>
+          <w:szCs w:val="21"/>
+        </w:rPr>
+        <w:t xml:space="preserve">Mostly the data includes </w:t>
+      </w:r>
+      <w:r>
+        <w:rPr>
+          <w:color w:val="0E0E0E"/>
+          <w:sz w:val="21"/>
+          <w:szCs w:val="21"/>
+        </w:rPr>
+        <w:t>only the endorsed candidate</w:t>
+      </w:r>
+      <w:r>
+        <w:rPr>
+          <w:color w:val="0E0E0E"/>
+          <w:sz w:val="21"/>
+          <w:szCs w:val="21"/>
+        </w:rPr>
+        <w:t xml:space="preserve">. </w:t>
+      </w:r>
+      <w:r>
+        <w:rPr>
+          <w:color w:val="0E0E0E"/>
+          <w:sz w:val="21"/>
+          <w:szCs w:val="21"/>
+        </w:rPr>
+        <w:t xml:space="preserve">The exception is if a candidate is explicitly not endorsed – for example, if they recommend voting </w:t>
+      </w:r>
+      <w:r>
+        <w:rPr>
+          <w:i/>
+          <w:color w:val="0E0E0E"/>
+          <w:sz w:val="21"/>
+          <w:szCs w:val="21"/>
+        </w:rPr>
+        <w:t>against</w:t>
+      </w:r>
+      <w:r>
+        <w:rPr>
+          <w:color w:val="0E0E0E"/>
+          <w:sz w:val="21"/>
+          <w:szCs w:val="21"/>
+        </w:rPr>
+        <w:t xml:space="preserve"> a candidate (but not necessarily for voting </w:t>
+      </w:r>
+      <w:r>
+        <w:rPr>
+          <w:i/>
+          <w:color w:val="0E0E0E"/>
+          <w:sz w:val="21"/>
+          <w:szCs w:val="21"/>
+        </w:rPr>
+        <w:t>for</w:t>
+      </w:r>
+      <w:r>
+        <w:rPr>
+          <w:color w:val="0E0E0E"/>
+          <w:sz w:val="21"/>
+          <w:szCs w:val="21"/>
+        </w:rPr>
+        <w:t xml:space="preserve"> the other candidate).</w:t>
+      </w:r>
+    </w:p>
+    <w:p>
+      <w:pPr>
+        <w:numPr>
+          <w:ilvl w:val="0"/>
+          <w:numId w:val="4"/>
+        </w:numPr>
+        <w:pBdr>
+          <w:top w:val="nil"/>
+          <w:left w:val="nil"/>
+          <w:bottom w:val="nil"/>
+          <w:right w:val="nil"/>
+          <w:between w:val="nil"/>
+        </w:pBdr>
+        <w:spacing w:before="180" w:after="0" w:line="240" w:lineRule="auto"/>
+        <w:rPr>
+          <w:color w:val="0E0E0E"/>
+          <w:sz w:val="21"/>
+          <w:szCs w:val="21"/>
+          <w:u w:val="single"/>
+        </w:rPr>
+      </w:pPr>
+      <w:proofErr w:type="spellStart"/>
+      <w:r>
+        <w:rPr>
+          <w:color w:val="0E0E0E"/>
+          <w:sz w:val="21"/>
+          <w:szCs w:val="21"/>
+          <w:u w:val="single"/>
+        </w:rPr>
+        <w:t>d_inc</w:t>
+      </w:r>
+      <w:proofErr w:type="spellEnd"/>
+      <w:r>
+        <w:rPr>
+          <w:color w:val="0E0E0E"/>
+          <w:sz w:val="21"/>
+          <w:szCs w:val="21"/>
+          <w:u w:val="single"/>
+        </w:rPr>
+        <w:t>:</w:t>
+      </w:r>
+      <w:r>
+        <w:rPr>
+          <w:color w:val="0E0E0E"/>
+          <w:sz w:val="21"/>
+          <w:szCs w:val="21"/>
+        </w:rPr>
+        <w:t xml:space="preserve"> is equal to 1 if the democrat is the incumbent, 0 otherwise</w:t>
+      </w:r>
+    </w:p>
+    <w:p>
+      <w:pPr>
+        <w:numPr>
+          <w:ilvl w:val="0"/>
+          <w:numId w:val="4"/>
+        </w:numPr>
+        <w:pBdr>
+          <w:top w:val="nil"/>
+          <w:left w:val="nil"/>
+          <w:bottom w:val="nil"/>
+          <w:right w:val="nil"/>
+          <w:between w:val="nil"/>
+        </w:pBdr>
+        <w:spacing w:before="180" w:after="0" w:line="240" w:lineRule="auto"/>
+        <w:rPr>
+          <w:color w:val="0E0E0E"/>
+          <w:sz w:val="21"/>
+          <w:szCs w:val="21"/>
+          <w:u w:val="single"/>
+        </w:rPr>
+      </w:pPr>
+      <w:proofErr w:type="spellStart"/>
+      <w:r>
+        <w:rPr>
+          <w:color w:val="0E0E0E"/>
+          <w:sz w:val="21"/>
+          <w:szCs w:val="21"/>
+          <w:u w:val="single"/>
+        </w:rPr>
+        <w:t>r_inc</w:t>
+      </w:r>
+      <w:proofErr w:type="spellEnd"/>
+      <w:r>
+        <w:rPr>
+          <w:color w:val="0E0E0E"/>
+          <w:sz w:val="21"/>
+          <w:szCs w:val="21"/>
+          <w:u w:val="single"/>
+        </w:rPr>
+        <w:t>:</w:t>
+      </w:r>
+      <w:r>
+        <w:rPr>
+          <w:color w:val="0E0E0E"/>
+          <w:sz w:val="21"/>
+          <w:szCs w:val="21"/>
+        </w:rPr>
+        <w:t xml:space="preserve"> is equal to 1 if the republican is the incumbent, 0 otherwise</w:t>
+      </w:r>
+    </w:p>
+    <w:p>
+      <w:pPr>
+        <w:numPr>
+          <w:ilvl w:val="0"/>
+          <w:numId w:val="4"/>
+        </w:numPr>
+        <w:pBdr>
+          <w:top w:val="nil"/>
+          <w:left w:val="nil"/>
+          <w:bottom w:val="nil"/>
+          <w:right w:val="nil"/>
+          <w:between w:val="nil"/>
+        </w:pBdr>
+        <w:spacing w:before="180" w:after="0" w:line="240" w:lineRule="auto"/>
+        <w:rPr>
+          <w:color w:val="0E0E0E"/>
+          <w:sz w:val="21"/>
+          <w:szCs w:val="21"/>
+          <w:u w:val="single"/>
+        </w:rPr>
+      </w:pPr>
+      <w:proofErr w:type="spellStart"/>
+      <w:r>
+        <w:rPr>
+          <w:color w:val="0E0E0E"/>
+          <w:sz w:val="21"/>
+          <w:szCs w:val="21"/>
+          <w:u w:val="single"/>
+        </w:rPr>
+        <w:t>o_inc</w:t>
+      </w:r>
+      <w:proofErr w:type="spellEnd"/>
+      <w:r>
+        <w:rPr>
+          <w:color w:val="0E0E0E"/>
+          <w:sz w:val="21"/>
+          <w:szCs w:val="21"/>
+          <w:u w:val="single"/>
+        </w:rPr>
+        <w:t>:</w:t>
+      </w:r>
+      <w:r>
+        <w:rPr>
+          <w:color w:val="0E0E0E"/>
+          <w:sz w:val="21"/>
+          <w:szCs w:val="21"/>
+        </w:rPr>
+        <w:t xml:space="preserve"> is equal to 1 if a candidate from a different party (or an “independent”) is the incumbent, 0 otherwise</w:t>
+      </w:r>
+    </w:p>
+    <w:p>
+      <w:pPr>
+        <w:numPr>
+          <w:ilvl w:val="0"/>
+          <w:numId w:val="4"/>
+        </w:numPr>
+        <w:pBdr>
+          <w:top w:val="nil"/>
+          <w:left w:val="nil"/>
+          <w:bottom w:val="nil"/>
+          <w:right w:val="nil"/>
+          <w:between w:val="nil"/>
+        </w:pBdr>
+        <w:spacing w:before="180" w:after="0" w:line="240" w:lineRule="auto"/>
+        <w:rPr>
+          <w:color w:val="0E0E0E"/>
+          <w:sz w:val="21"/>
+          <w:szCs w:val="21"/>
+        </w:rPr>
+      </w:pPr>
+      <w:proofErr w:type="spellStart"/>
+      <w:r>
+        <w:rPr>
+          <w:color w:val="0E0E0E"/>
+          <w:sz w:val="21"/>
+          <w:szCs w:val="21"/>
+          <w:u w:val="single"/>
+        </w:rPr>
+        <w:t>notes_endorse</w:t>
+      </w:r>
+      <w:proofErr w:type="spellEnd"/>
+      <w:r>
+        <w:rPr>
+          <w:color w:val="0E0E0E"/>
+          <w:sz w:val="21"/>
+          <w:szCs w:val="21"/>
+        </w:rPr>
+        <w:t xml:space="preserve">: any additional notes about the endorsement. Try to add in “incumbent” when possible (i.e. when indicated on the endorsement page, especially if there is missing party info), or “neither endorsed” or “both endorsed” when those cases arise. </w:t>
+      </w:r>
+    </w:p>
+    <w:p>
+      <w:pPr>
+        <w:pBdr>
+          <w:top w:val="nil"/>
+          <w:left w:val="nil"/>
+          <w:bottom w:val="nil"/>
+          <w:right w:val="nil"/>
+          <w:between w:val="nil"/>
+        </w:pBdr>
+        <w:spacing w:after="0" w:line="240" w:lineRule="auto"/>
+        <w:rPr>
+          <w:color w:val="0E0E0E"/>
+          <w:sz w:val="21"/>
+          <w:szCs w:val="21"/>
+        </w:rPr>
+      </w:pPr>
+    </w:p>
+    <w:p>
+      <w:pPr>
+        <w:pBdr>
+          <w:top w:val="nil"/>
+          <w:left w:val="nil"/>
+          <w:bottom w:val="nil"/>
+          <w:right w:val="nil"/>
+          <w:between w:val="nil"/>
+        </w:pBdr>
+        <w:spacing w:before="180" w:after="0" w:line="240" w:lineRule="auto"/>
+        <w:rPr>
+          <w:b/>
+          <w:color w:val="0E0E0E"/>
+        </w:rPr>
+      </w:pPr>
+      <w:r>
+        <w:rPr>
+          <w:b/>
+          <w:color w:val="0E0E0E"/>
+        </w:rPr>
+        <w:lastRenderedPageBreak/>
+        <w:t>Variables – PROPOSITION/AMENDMENT ENDORSEMENTS</w:t>
+      </w:r>
+    </w:p>
+    <w:p>
+      <w:pPr>
+        <w:numPr>
+          <w:ilvl w:val="0"/>
+          <w:numId w:val="4"/>
+        </w:numPr>
+        <w:pBdr>
+          <w:top w:val="nil"/>
+          <w:left w:val="nil"/>
+          <w:bottom w:val="nil"/>
+          <w:right w:val="nil"/>
+          <w:between w:val="nil"/>
+        </w:pBdr>
+        <w:spacing w:before="180" w:after="0" w:line="240" w:lineRule="auto"/>
+        <w:rPr>
+          <w:color w:val="0E0E0E"/>
+          <w:sz w:val="21"/>
+          <w:szCs w:val="21"/>
+        </w:rPr>
+      </w:pPr>
+      <w:proofErr w:type="spellStart"/>
+      <w:r>
+        <w:rPr>
+          <w:color w:val="0E0E0E"/>
+          <w:sz w:val="21"/>
+          <w:szCs w:val="21"/>
+          <w:u w:val="single"/>
+        </w:rPr>
+        <w:t>state_newspaper</w:t>
+      </w:r>
+      <w:proofErr w:type="spellEnd"/>
+      <w:r>
+        <w:rPr>
+          <w:color w:val="0E0E0E"/>
+          <w:sz w:val="21"/>
+          <w:szCs w:val="21"/>
+        </w:rPr>
+        <w:t>: state where the paper is located (two-letter abbreviation)</w:t>
+      </w:r>
+    </w:p>
+    <w:p>
+      <w:pPr>
+        <w:numPr>
+          <w:ilvl w:val="0"/>
+          <w:numId w:val="4"/>
+        </w:numPr>
+        <w:pBdr>
+          <w:top w:val="nil"/>
+          <w:left w:val="nil"/>
+          <w:bottom w:val="nil"/>
+          <w:right w:val="nil"/>
+          <w:between w:val="nil"/>
+        </w:pBdr>
+        <w:spacing w:before="180" w:after="0" w:line="240" w:lineRule="auto"/>
+        <w:rPr>
+          <w:color w:val="0E0E0E"/>
+          <w:sz w:val="21"/>
+          <w:szCs w:val="21"/>
+        </w:rPr>
+      </w:pPr>
+      <w:r>
+        <w:rPr>
+          <w:color w:val="0E0E0E"/>
+          <w:sz w:val="21"/>
+          <w:szCs w:val="21"/>
+          <w:u w:val="single"/>
+        </w:rPr>
+        <w:t>newspaper</w:t>
+      </w:r>
+      <w:r>
+        <w:rPr>
+          <w:color w:val="0E0E0E"/>
+          <w:sz w:val="21"/>
+          <w:szCs w:val="21"/>
+        </w:rPr>
+        <w:t>: name of newspaper</w:t>
+      </w:r>
+    </w:p>
+    <w:p>
+      <w:pPr>
+        <w:numPr>
+          <w:ilvl w:val="0"/>
+          <w:numId w:val="4"/>
+        </w:numPr>
+        <w:pBdr>
+          <w:top w:val="nil"/>
+          <w:left w:val="nil"/>
+          <w:bottom w:val="nil"/>
+          <w:right w:val="nil"/>
+          <w:between w:val="nil"/>
+        </w:pBdr>
+        <w:spacing w:before="180" w:after="0" w:line="240" w:lineRule="auto"/>
+        <w:rPr>
+          <w:color w:val="0E0E0E"/>
+          <w:sz w:val="21"/>
+          <w:szCs w:val="21"/>
+        </w:rPr>
+      </w:pPr>
+      <w:proofErr w:type="spellStart"/>
+      <w:r>
+        <w:rPr>
+          <w:color w:val="0E0E0E"/>
+          <w:sz w:val="21"/>
+          <w:szCs w:val="21"/>
+          <w:u w:val="single"/>
+        </w:rPr>
+        <w:t>newspaper_id</w:t>
+      </w:r>
+      <w:proofErr w:type="spellEnd"/>
+      <w:r>
+        <w:rPr>
+          <w:color w:val="0E0E0E"/>
+          <w:sz w:val="21"/>
+          <w:szCs w:val="21"/>
+        </w:rPr>
+        <w:t>: newspaper ID number</w:t>
+      </w:r>
+    </w:p>
+    <w:p>
+      <w:pPr>
+        <w:numPr>
+          <w:ilvl w:val="0"/>
+          <w:numId w:val="4"/>
+        </w:numPr>
+        <w:pBdr>
+          <w:top w:val="nil"/>
+          <w:left w:val="nil"/>
+          <w:bottom w:val="nil"/>
+          <w:right w:val="nil"/>
+          <w:between w:val="nil"/>
+        </w:pBdr>
+        <w:spacing w:before="180" w:after="0" w:line="240" w:lineRule="auto"/>
+        <w:rPr>
+          <w:color w:val="0E0E0E"/>
+          <w:sz w:val="21"/>
+          <w:szCs w:val="21"/>
+        </w:rPr>
+      </w:pPr>
+      <w:r>
+        <w:rPr>
+          <w:color w:val="0E0E0E"/>
+          <w:sz w:val="21"/>
+          <w:szCs w:val="21"/>
+          <w:u w:val="single"/>
+        </w:rPr>
+        <w:t>year</w:t>
+      </w:r>
+      <w:r>
+        <w:rPr>
+          <w:color w:val="0E0E0E"/>
+          <w:sz w:val="21"/>
+          <w:szCs w:val="21"/>
+        </w:rPr>
+        <w:t>: year of election when the endorsement is occurring</w:t>
+      </w:r>
+    </w:p>
+    <w:p>
+      <w:pPr>
+        <w:numPr>
+          <w:ilvl w:val="0"/>
+          <w:numId w:val="4"/>
+        </w:numPr>
+        <w:pBdr>
+          <w:top w:val="nil"/>
+          <w:left w:val="nil"/>
+          <w:bottom w:val="nil"/>
+          <w:right w:val="nil"/>
+          <w:between w:val="nil"/>
+        </w:pBdr>
+        <w:spacing w:before="180" w:after="0" w:line="240" w:lineRule="auto"/>
+        <w:rPr>
+          <w:color w:val="0E0E0E"/>
+          <w:sz w:val="21"/>
+          <w:szCs w:val="21"/>
+          <w:u w:val="single"/>
+        </w:rPr>
+      </w:pPr>
+      <w:proofErr w:type="spellStart"/>
+      <w:r>
+        <w:rPr>
+          <w:color w:val="0E0E0E"/>
+          <w:sz w:val="21"/>
+          <w:szCs w:val="21"/>
+          <w:u w:val="single"/>
+        </w:rPr>
+        <w:t>state_election</w:t>
+      </w:r>
+      <w:proofErr w:type="spellEnd"/>
+      <w:r>
+        <w:rPr>
+          <w:color w:val="0E0E0E"/>
+          <w:sz w:val="21"/>
+          <w:szCs w:val="21"/>
+          <w:u w:val="single"/>
+        </w:rPr>
+        <w:t>:</w:t>
+      </w:r>
+      <w:r>
+        <w:rPr>
+          <w:color w:val="0E0E0E"/>
+          <w:sz w:val="21"/>
+          <w:szCs w:val="21"/>
+        </w:rPr>
+        <w:t xml:space="preserve"> state of the proposition. Some papers located in one state will endorse propositions in another state. Usually, this is the same as </w:t>
+      </w:r>
+      <w:proofErr w:type="spellStart"/>
+      <w:r>
+        <w:rPr>
+          <w:color w:val="0E0E0E"/>
+          <w:sz w:val="21"/>
+          <w:szCs w:val="21"/>
+        </w:rPr>
+        <w:t>state_newspaper</w:t>
+      </w:r>
+      <w:proofErr w:type="spellEnd"/>
+      <w:r>
+        <w:rPr>
+          <w:color w:val="0E0E0E"/>
+          <w:sz w:val="21"/>
+          <w:szCs w:val="21"/>
+        </w:rPr>
+        <w:t xml:space="preserve"> but not always.</w:t>
+      </w:r>
+      <w:r>
+        <w:rPr>
+          <w:color w:val="0E0E0E"/>
+          <w:sz w:val="21"/>
+          <w:szCs w:val="21"/>
+          <w:u w:val="single"/>
+        </w:rPr>
+        <w:t xml:space="preserve"> </w:t>
+      </w:r>
+    </w:p>
+    <w:p>
+      <w:pPr>
+        <w:numPr>
+          <w:ilvl w:val="0"/>
+          <w:numId w:val="4"/>
+        </w:numPr>
+        <w:pBdr>
+          <w:top w:val="nil"/>
+          <w:left w:val="nil"/>
+          <w:bottom w:val="nil"/>
+          <w:right w:val="nil"/>
+          <w:between w:val="nil"/>
+        </w:pBdr>
+        <w:spacing w:before="180" w:after="0" w:line="240" w:lineRule="auto"/>
+        <w:rPr>
+          <w:color w:val="0E0E0E"/>
+          <w:sz w:val="21"/>
+          <w:szCs w:val="21"/>
+          <w:u w:val="single"/>
+        </w:rPr>
+      </w:pPr>
+      <w:proofErr w:type="spellStart"/>
+      <w:r>
+        <w:rPr>
+          <w:color w:val="0E0E0E"/>
+          <w:sz w:val="21"/>
+          <w:szCs w:val="21"/>
+          <w:u w:val="single"/>
+        </w:rPr>
+        <w:t>prop_type</w:t>
+      </w:r>
+      <w:proofErr w:type="spellEnd"/>
+      <w:r>
+        <w:rPr>
+          <w:color w:val="0E0E0E"/>
+          <w:sz w:val="21"/>
+          <w:szCs w:val="21"/>
+          <w:u w:val="single"/>
+        </w:rPr>
+        <w:t>:</w:t>
+      </w:r>
+      <w:r>
+        <w:rPr>
+          <w:color w:val="0E0E0E"/>
+          <w:sz w:val="21"/>
+          <w:szCs w:val="21"/>
+        </w:rPr>
+        <w:t xml:space="preserve"> the “type” of proposition/amendment/question. </w:t>
+      </w:r>
+    </w:p>
+    <w:p>
+      <w:pPr>
+        <w:numPr>
+          <w:ilvl w:val="1"/>
+          <w:numId w:val="4"/>
+        </w:numPr>
+        <w:pBdr>
+          <w:top w:val="nil"/>
+          <w:left w:val="nil"/>
+          <w:bottom w:val="nil"/>
+          <w:right w:val="nil"/>
+          <w:between w:val="nil"/>
+        </w:pBdr>
+        <w:spacing w:before="180" w:after="0" w:line="240" w:lineRule="auto"/>
+        <w:rPr>
+          <w:color w:val="0E0E0E"/>
+          <w:sz w:val="21"/>
+          <w:szCs w:val="21"/>
+          <w:u w:val="single"/>
+        </w:rPr>
+      </w:pPr>
+      <w:r>
+        <w:rPr>
+          <w:color w:val="0E0E0E"/>
+          <w:sz w:val="21"/>
+          <w:szCs w:val="21"/>
+        </w:rPr>
+        <w:t>Examples are “proposition”, “amendment”, “question”, etc. (record however it is reported in the newspaper). This may vary by state or may vary based on whether the proposition/amendment/question is at the state vs. local level.</w:t>
+      </w:r>
+    </w:p>
+    <w:p>
+      <w:pPr>
+        <w:numPr>
+          <w:ilvl w:val="0"/>
+          <w:numId w:val="4"/>
+        </w:numPr>
+        <w:pBdr>
+          <w:top w:val="nil"/>
+          <w:left w:val="nil"/>
+          <w:bottom w:val="nil"/>
+          <w:right w:val="nil"/>
+          <w:between w:val="nil"/>
+        </w:pBdr>
+        <w:spacing w:before="180" w:after="0" w:line="240" w:lineRule="auto"/>
+        <w:rPr>
+          <w:color w:val="0E0E0E"/>
+          <w:sz w:val="21"/>
+          <w:szCs w:val="21"/>
+        </w:rPr>
+      </w:pPr>
+      <w:proofErr w:type="spellStart"/>
+      <w:r>
+        <w:rPr>
+          <w:color w:val="0E0E0E"/>
+          <w:sz w:val="21"/>
+          <w:szCs w:val="21"/>
+          <w:u w:val="single"/>
+        </w:rPr>
+        <w:t>prop_num</w:t>
+      </w:r>
+      <w:proofErr w:type="spellEnd"/>
+      <w:r>
+        <w:rPr>
+          <w:color w:val="0E0E0E"/>
+          <w:sz w:val="21"/>
+          <w:szCs w:val="21"/>
+        </w:rPr>
+        <w:t>: number (or letter) of the proposition, e.g. for recording proposition 101 this variable would be equal to “101”; for Question 2B, this variable would be equal to “2B”</w:t>
+      </w:r>
+    </w:p>
+    <w:p>
+      <w:pPr>
+        <w:numPr>
+          <w:ilvl w:val="0"/>
+          <w:numId w:val="4"/>
+        </w:numPr>
+        <w:pBdr>
+          <w:top w:val="nil"/>
+          <w:left w:val="nil"/>
+          <w:bottom w:val="nil"/>
+          <w:right w:val="nil"/>
+          <w:between w:val="nil"/>
+        </w:pBdr>
+        <w:spacing w:before="180" w:after="0" w:line="240" w:lineRule="auto"/>
+        <w:rPr>
+          <w:color w:val="0E0E0E"/>
+          <w:sz w:val="21"/>
+          <w:szCs w:val="21"/>
+        </w:rPr>
+      </w:pPr>
+      <w:proofErr w:type="spellStart"/>
+      <w:r>
+        <w:rPr>
+          <w:color w:val="0E0E0E"/>
+          <w:sz w:val="21"/>
+          <w:szCs w:val="21"/>
+          <w:u w:val="single"/>
+        </w:rPr>
+        <w:t>prop_desc</w:t>
+      </w:r>
+      <w:proofErr w:type="spellEnd"/>
+      <w:r>
+        <w:rPr>
+          <w:color w:val="0E0E0E"/>
+          <w:sz w:val="21"/>
+          <w:szCs w:val="21"/>
+        </w:rPr>
+        <w:t>: a short description (1 sentence or less) of the what the proposition/amendment is about</w:t>
+      </w:r>
+    </w:p>
+    <w:p>
+      <w:pPr>
+        <w:numPr>
+          <w:ilvl w:val="1"/>
+          <w:numId w:val="4"/>
+        </w:numPr>
+        <w:pBdr>
+          <w:top w:val="nil"/>
+          <w:left w:val="nil"/>
+          <w:bottom w:val="nil"/>
+          <w:right w:val="nil"/>
+          <w:between w:val="nil"/>
+        </w:pBdr>
+        <w:spacing w:before="180" w:after="0" w:line="240" w:lineRule="auto"/>
+        <w:rPr>
+          <w:color w:val="0E0E0E"/>
+          <w:sz w:val="21"/>
+          <w:szCs w:val="21"/>
+        </w:rPr>
+      </w:pPr>
+      <w:r>
+        <w:rPr>
+          <w:color w:val="0E0E0E"/>
+          <w:sz w:val="21"/>
+          <w:szCs w:val="21"/>
+        </w:rPr>
+        <w:t>Some examples of acceptable descriptions:</w:t>
+      </w:r>
+    </w:p>
+    <w:p>
+      <w:pPr>
+        <w:numPr>
+          <w:ilvl w:val="2"/>
+          <w:numId w:val="4"/>
+        </w:numPr>
+        <w:pBdr>
+          <w:top w:val="nil"/>
+          <w:left w:val="nil"/>
+          <w:bottom w:val="nil"/>
+          <w:right w:val="nil"/>
+          <w:between w:val="nil"/>
+        </w:pBdr>
+        <w:spacing w:before="180" w:after="0" w:line="240" w:lineRule="auto"/>
+        <w:rPr>
+          <w:color w:val="0E0E0E"/>
+          <w:sz w:val="21"/>
+          <w:szCs w:val="21"/>
+        </w:rPr>
+      </w:pPr>
+      <w:r>
+        <w:rPr>
+          <w:color w:val="0E0E0E"/>
+          <w:sz w:val="21"/>
+          <w:szCs w:val="21"/>
+        </w:rPr>
+        <w:t>Ex1: “RELATING TO SAME DAY AIRBORNE HUNTING OF CERTAIN ANIMALS”</w:t>
+      </w:r>
+    </w:p>
+    <w:p>
+      <w:pPr>
+        <w:numPr>
+          <w:ilvl w:val="2"/>
+          <w:numId w:val="4"/>
+        </w:numPr>
+        <w:pBdr>
+          <w:top w:val="nil"/>
+          <w:left w:val="nil"/>
+          <w:bottom w:val="nil"/>
+          <w:right w:val="nil"/>
+          <w:between w:val="nil"/>
+        </w:pBdr>
+        <w:spacing w:before="180" w:after="0" w:line="240" w:lineRule="auto"/>
+        <w:rPr>
+          <w:color w:val="0E0E0E"/>
+          <w:sz w:val="21"/>
+          <w:szCs w:val="21"/>
+        </w:rPr>
+      </w:pPr>
+      <w:r>
+        <w:rPr>
+          <w:color w:val="0E0E0E"/>
+          <w:sz w:val="21"/>
+          <w:szCs w:val="21"/>
+        </w:rPr>
+        <w:t>Ex2: “$315 MILLION BONDS FOR ROADS AND PORTS”</w:t>
+      </w:r>
+    </w:p>
+    <w:p>
+      <w:pPr>
+        <w:numPr>
+          <w:ilvl w:val="2"/>
+          <w:numId w:val="4"/>
+        </w:numPr>
+        <w:pBdr>
+          <w:top w:val="nil"/>
+          <w:left w:val="nil"/>
+          <w:bottom w:val="nil"/>
+          <w:right w:val="nil"/>
+          <w:between w:val="nil"/>
+        </w:pBdr>
+        <w:spacing w:before="180" w:after="0" w:line="240" w:lineRule="auto"/>
+        <w:rPr>
+          <w:color w:val="0E0E0E"/>
+          <w:sz w:val="21"/>
+          <w:szCs w:val="21"/>
+        </w:rPr>
+      </w:pPr>
+      <w:r>
+        <w:rPr>
+          <w:color w:val="0E0E0E"/>
+          <w:sz w:val="21"/>
+          <w:szCs w:val="21"/>
+        </w:rPr>
+        <w:t>Ex3: “1/8 OF 1% SALES AND USE TAX FOR GAME AND FISH”</w:t>
+      </w:r>
+    </w:p>
+    <w:p>
+      <w:pPr>
+        <w:numPr>
+          <w:ilvl w:val="1"/>
+          <w:numId w:val="4"/>
+        </w:numPr>
+        <w:pBdr>
+          <w:top w:val="nil"/>
+          <w:left w:val="nil"/>
+          <w:bottom w:val="nil"/>
+          <w:right w:val="nil"/>
+          <w:between w:val="nil"/>
+        </w:pBdr>
+        <w:spacing w:before="180" w:after="0" w:line="240" w:lineRule="auto"/>
+        <w:rPr>
+          <w:color w:val="0E0E0E"/>
+          <w:sz w:val="21"/>
+          <w:szCs w:val="21"/>
+        </w:rPr>
+      </w:pPr>
+      <w:r>
+        <w:rPr>
+          <w:color w:val="0E0E0E"/>
+          <w:sz w:val="21"/>
+          <w:szCs w:val="21"/>
+        </w:rPr>
+        <w:t xml:space="preserve">This field can be left blank if there is no info about the proposition/amendment in the newspaper article endorsement </w:t>
+      </w:r>
+    </w:p>
+    <w:p>
+      <w:pPr>
+        <w:numPr>
+          <w:ilvl w:val="0"/>
+          <w:numId w:val="4"/>
+        </w:numPr>
+        <w:pBdr>
+          <w:top w:val="nil"/>
+          <w:left w:val="nil"/>
+          <w:bottom w:val="nil"/>
+          <w:right w:val="nil"/>
+          <w:between w:val="nil"/>
+        </w:pBdr>
+        <w:spacing w:before="180" w:after="0" w:line="240" w:lineRule="auto"/>
+        <w:rPr>
+          <w:color w:val="0E0E0E"/>
+          <w:sz w:val="21"/>
+          <w:szCs w:val="21"/>
+        </w:rPr>
+      </w:pPr>
+      <w:r>
+        <w:rPr>
+          <w:color w:val="0E0E0E"/>
+          <w:sz w:val="21"/>
+          <w:szCs w:val="21"/>
+          <w:u w:val="single"/>
+        </w:rPr>
+        <w:t>endorsed</w:t>
+      </w:r>
+      <w:r>
+        <w:rPr>
+          <w:color w:val="0E0E0E"/>
+          <w:sz w:val="21"/>
+          <w:szCs w:val="21"/>
+        </w:rPr>
+        <w:t xml:space="preserve">: endorsed=1 if the proposition is endorsed/recommended, endorsed=0 if the proposition is NOT endorsed/recommended. </w:t>
+      </w:r>
+    </w:p>
+    <w:p>
+      <w:pPr>
+        <w:numPr>
+          <w:ilvl w:val="0"/>
+          <w:numId w:val="4"/>
+        </w:numPr>
+        <w:pBdr>
+          <w:top w:val="nil"/>
+          <w:left w:val="nil"/>
+          <w:bottom w:val="nil"/>
+          <w:right w:val="nil"/>
+          <w:between w:val="nil"/>
+        </w:pBdr>
+        <w:spacing w:before="180" w:after="0" w:line="240" w:lineRule="auto"/>
+        <w:rPr>
+          <w:color w:val="0E0E0E"/>
+          <w:sz w:val="21"/>
+          <w:szCs w:val="21"/>
+        </w:rPr>
+      </w:pPr>
+      <w:proofErr w:type="spellStart"/>
+      <w:r>
+        <w:rPr>
+          <w:color w:val="0E0E0E"/>
+          <w:sz w:val="21"/>
+          <w:szCs w:val="21"/>
+          <w:u w:val="single"/>
+        </w:rPr>
+        <w:t>notes_endorse</w:t>
+      </w:r>
+      <w:proofErr w:type="spellEnd"/>
+      <w:r>
+        <w:rPr>
+          <w:color w:val="0E0E0E"/>
+          <w:sz w:val="21"/>
+          <w:szCs w:val="21"/>
+        </w:rPr>
+        <w:t>: any additional notes about the proposition or endorsement.</w:t>
+      </w:r>
+    </w:p>
+    <w:p>
+      <w:pPr>
+        <w:pBdr>
+          <w:top w:val="nil"/>
+          <w:left w:val="nil"/>
+          <w:bottom w:val="nil"/>
+          <w:right w:val="nil"/>
+          <w:between w:val="nil"/>
+        </w:pBdr>
+        <w:spacing w:before="180" w:after="0" w:line="240" w:lineRule="auto"/>
+        <w:ind w:left="315" w:hanging="315"/>
+        <w:rPr>
+          <w:color w:val="0E0E0E"/>
+          <w:sz w:val="21"/>
+          <w:szCs w:val="21"/>
+        </w:rPr>
+      </w:pPr>
     </w:p>
     <w:p>
       <w:pPr>
         <w:pStyle w:val="p1"/>
         <w:rPr>
           <w:rFonts w:ascii="Aptos" w:hAnsi="Aptos"/>
+          <w:b/>
+          <w:bCs/>
         </w:rPr>
       </w:pPr>
     </w:p>
@@ -527,6 +2238,205 @@
 <file path=word/numbering.xml><?xml version="1.0" encoding="utf-8"?>
 <w:numbering xmlns:wpc="http://schemas.microsoft.com/office/word/2010/wordprocessingCanvas" xmlns:cx="http://schemas.microsoft.com/office/drawing/2014/chartex" xmlns:cx1="http://schemas.microsoft.com/office/drawing/2015/9/8/chartex" xmlns:cx2="http://schemas.microsoft.com/office/drawing/2015/10/21/chartex" xmlns:cx3="http://schemas.microsoft.com/office/drawing/2016/5/9/chartex" xmlns:cx4="http://schemas.microsoft.com/office/drawing/2016/5/10/chartex" xmlns:cx5="http://schemas.microsoft.com/office/drawing/2016/5/11/chartex" xmlns:cx6="http://schemas.microsoft.com/office/drawing/2016/5/12/chartex" xmlns:cx7="http://schemas.microsoft.com/office/drawing/2016/5/13/chartex" xmlns:cx8="http://schemas.microsoft.com/office/drawing/2016/5/14/chartex" xmlns:mc="http://schemas.openxmlformats.org/markup-compatibility/2006" xmlns:aink="http://schemas.microsoft.com/office/drawing/2016/ink" xmlns:am3d="http://schemas.microsoft.com/office/drawing/2017/model3d" xmlns:o="urn:schemas-microsoft-com:office:office" xmlns:oel="http://schemas.microsoft.com/office/2019/extlst" xmlns:r="http://schemas.openxmlformats.org/officeDocument/2006/relationships" xmlns:m="http://schemas.openxmlformats.org/officeDocument/2006/math" xmlns:v="urn:schemas-microsoft-com:vml" xmlns:wp14="http://schemas.microsoft.com/office/word/2010/wordprocessingDrawing" xmlns:wp="http://schemas.openxmlformats.org/drawingml/2006/wordprocessingDrawing" xmlns:w10="urn:schemas-microsoft-com:office:word" xmlns:w="http://schemas.openxmlformats.org/wordprocessingml/2006/main" xmlns:w14="http://schemas.microsoft.com/office/word/2010/wordml" xmlns:w15="http://schemas.microsoft.com/office/word/2012/wordml" xmlns:w16cex="http://schemas.microsoft.com/office/word/2018/wordml/cex" xmlns:w16cid="http://schemas.microsoft.com/office/word/2016/wordml/cid" xmlns:w16="http://schemas.microsoft.com/office/word/2018/wordml" xmlns:w16du="http://schemas.microsoft.com/office/word/2023/wordml/word16du" xmlns:w16sdtdh="http://schemas.microsoft.com/office/word/2020/wordml/sdtdatahash" xmlns:w16sdtfl="http://schemas.microsoft.com/office/word/2024/wordml/sdtformatlock" xmlns:w16se="http://schemas.microsoft.com/office/word/2015/wordml/symex" xmlns:wpg="http://schemas.microsoft.com/office/word/2010/wordprocessingGroup" xmlns:wpi="http://schemas.microsoft.com/office/word/2010/wordprocessingInk" xmlns:wne="http://schemas.microsoft.com/office/word/2006/wordml" xmlns:wps="http://schemas.microsoft.com/office/word/2010/wordprocessingShape" mc:Ignorable="w14 w15 w16se w16cid w16 w16cex w16sdtdh w16sdtfl w16du wp14">
   <w:abstractNum w:abstractNumId="0" w15:restartNumberingAfterBreak="0">
+    <w:nsid w:val="263E55D0"/>
+    <w:multiLevelType w:val="multilevel"/>
+    <w:tmpl w:val="A26A3714"/>
+    <w:lvl w:ilvl="0">
+      <w:start w:val="1"/>
+      <w:numFmt w:val="bullet"/>
+      <w:lvlText w:val="●"/>
+      <w:lvlJc w:val="left"/>
+      <w:pPr>
+        <w:ind w:left="720" w:hanging="360"/>
+      </w:pPr>
+      <w:rPr>
+        <w:rFonts w:ascii="Noto Sans Symbols" w:eastAsia="Noto Sans Symbols" w:hAnsi="Noto Sans Symbols" w:cs="Noto Sans Symbols"/>
+      </w:rPr>
+    </w:lvl>
+    <w:lvl w:ilvl="1">
+      <w:start w:val="1"/>
+      <w:numFmt w:val="bullet"/>
+      <w:lvlText w:val="o"/>
+      <w:lvlJc w:val="left"/>
+      <w:pPr>
+        <w:ind w:left="1440" w:hanging="360"/>
+      </w:pPr>
+      <w:rPr>
+        <w:rFonts w:ascii="Courier New" w:eastAsia="Courier New" w:hAnsi="Courier New" w:cs="Courier New"/>
+      </w:rPr>
+    </w:lvl>
+    <w:lvl w:ilvl="2">
+      <w:start w:val="1"/>
+      <w:numFmt w:val="bullet"/>
+      <w:lvlText w:val="▪"/>
+      <w:lvlJc w:val="left"/>
+      <w:pPr>
+        <w:ind w:left="2160" w:hanging="360"/>
+      </w:pPr>
+      <w:rPr>
+        <w:rFonts w:ascii="Noto Sans Symbols" w:eastAsia="Noto Sans Symbols" w:hAnsi="Noto Sans Symbols" w:cs="Noto Sans Symbols"/>
+      </w:rPr>
+    </w:lvl>
+    <w:lvl w:ilvl="3">
+      <w:start w:val="1"/>
+      <w:numFmt w:val="bullet"/>
+      <w:lvlText w:val="●"/>
+      <w:lvlJc w:val="left"/>
+      <w:pPr>
+        <w:ind w:left="2880" w:hanging="360"/>
+      </w:pPr>
+      <w:rPr>
+        <w:rFonts w:ascii="Noto Sans Symbols" w:eastAsia="Noto Sans Symbols" w:hAnsi="Noto Sans Symbols" w:cs="Noto Sans Symbols"/>
+      </w:rPr>
+    </w:lvl>
+    <w:lvl w:ilvl="4">
+      <w:start w:val="1"/>
+      <w:numFmt w:val="bullet"/>
+      <w:lvlText w:val="o"/>
+      <w:lvlJc w:val="left"/>
+      <w:pPr>
+        <w:ind w:left="3600" w:hanging="360"/>
+      </w:pPr>
+      <w:rPr>
+        <w:rFonts w:ascii="Courier New" w:eastAsia="Courier New" w:hAnsi="Courier New" w:cs="Courier New"/>
+      </w:rPr>
+    </w:lvl>
+    <w:lvl w:ilvl="5">
+      <w:start w:val="1"/>
+      <w:numFmt w:val="bullet"/>
+      <w:lvlText w:val="▪"/>
+      <w:lvlJc w:val="left"/>
+      <w:pPr>
+        <w:ind w:left="4320" w:hanging="360"/>
+      </w:pPr>
+      <w:rPr>
+        <w:rFonts w:ascii="Noto Sans Symbols" w:eastAsia="Noto Sans Symbols" w:hAnsi="Noto Sans Symbols" w:cs="Noto Sans Symbols"/>
+      </w:rPr>
+    </w:lvl>
+    <w:lvl w:ilvl="6">
+      <w:start w:val="1"/>
+      <w:numFmt w:val="bullet"/>
+      <w:lvlText w:val="●"/>
+      <w:lvlJc w:val="left"/>
+      <w:pPr>
+        <w:ind w:left="5040" w:hanging="360"/>
+      </w:pPr>
+      <w:rPr>
+        <w:rFonts w:ascii="Noto Sans Symbols" w:eastAsia="Noto Sans Symbols" w:hAnsi="Noto Sans Symbols" w:cs="Noto Sans Symbols"/>
+      </w:rPr>
+    </w:lvl>
+    <w:lvl w:ilvl="7">
+      <w:start w:val="1"/>
+      <w:numFmt w:val="bullet"/>
+      <w:lvlText w:val="o"/>
+      <w:lvlJc w:val="left"/>
+      <w:pPr>
+        <w:ind w:left="5760" w:hanging="360"/>
+      </w:pPr>
+      <w:rPr>
+        <w:rFonts w:ascii="Courier New" w:eastAsia="Courier New" w:hAnsi="Courier New" w:cs="Courier New"/>
+      </w:rPr>
+    </w:lvl>
+    <w:lvl w:ilvl="8">
+      <w:start w:val="1"/>
+      <w:numFmt w:val="bullet"/>
+      <w:lvlText w:val="▪"/>
+      <w:lvlJc w:val="left"/>
+      <w:pPr>
+        <w:ind w:left="6480" w:hanging="360"/>
+      </w:pPr>
+      <w:rPr>
+        <w:rFonts w:ascii="Noto Sans Symbols" w:eastAsia="Noto Sans Symbols" w:hAnsi="Noto Sans Symbols" w:cs="Noto Sans Symbols"/>
+      </w:rPr>
+    </w:lvl>
+  </w:abstractNum>
+  <w:abstractNum w:abstractNumId="1" w15:restartNumberingAfterBreak="0">
+    <w:nsid w:val="3B817C6A"/>
+    <w:multiLevelType w:val="multilevel"/>
+    <w:tmpl w:val="5EA2CC2A"/>
+    <w:lvl w:ilvl="0">
+      <w:start w:val="1"/>
+      <w:numFmt w:val="upperLetter"/>
+      <w:lvlText w:val="%1."/>
+      <w:lvlJc w:val="left"/>
+      <w:pPr>
+        <w:ind w:left="720" w:hanging="360"/>
+      </w:pPr>
+    </w:lvl>
+    <w:lvl w:ilvl="1">
+      <w:start w:val="1"/>
+      <w:numFmt w:val="lowerLetter"/>
+      <w:lvlText w:val="%2."/>
+      <w:lvlJc w:val="left"/>
+      <w:pPr>
+        <w:ind w:left="1440" w:hanging="360"/>
+      </w:pPr>
+    </w:lvl>
+    <w:lvl w:ilvl="2">
+      <w:start w:val="1"/>
+      <w:numFmt w:val="lowerRoman"/>
+      <w:lvlText w:val="%3."/>
+      <w:lvlJc w:val="right"/>
+      <w:pPr>
+        <w:ind w:left="2160" w:hanging="180"/>
+      </w:pPr>
+    </w:lvl>
+    <w:lvl w:ilvl="3">
+      <w:start w:val="1"/>
+      <w:numFmt w:val="decimal"/>
+      <w:lvlText w:val="%4."/>
+      <w:lvlJc w:val="left"/>
+      <w:pPr>
+        <w:ind w:left="2880" w:hanging="360"/>
+      </w:pPr>
+    </w:lvl>
+    <w:lvl w:ilvl="4">
+      <w:start w:val="1"/>
+      <w:numFmt w:val="lowerLetter"/>
+      <w:lvlText w:val="%5."/>
+      <w:lvlJc w:val="left"/>
+      <w:pPr>
+        <w:ind w:left="3600" w:hanging="360"/>
+      </w:pPr>
+    </w:lvl>
+    <w:lvl w:ilvl="5">
+      <w:start w:val="1"/>
+      <w:numFmt w:val="lowerRoman"/>
+      <w:lvlText w:val="%6."/>
+      <w:lvlJc w:val="right"/>
+      <w:pPr>
+        <w:ind w:left="4320" w:hanging="180"/>
+      </w:pPr>
+    </w:lvl>
+    <w:lvl w:ilvl="6">
+      <w:start w:val="1"/>
+      <w:numFmt w:val="decimal"/>
+      <w:lvlText w:val="%7."/>
+      <w:lvlJc w:val="left"/>
+      <w:pPr>
+        <w:ind w:left="5040" w:hanging="360"/>
+      </w:pPr>
+    </w:lvl>
+    <w:lvl w:ilvl="7">
+      <w:start w:val="1"/>
+      <w:numFmt w:val="lowerLetter"/>
+      <w:lvlText w:val="%8."/>
+      <w:lvlJc w:val="left"/>
+      <w:pPr>
+        <w:ind w:left="5760" w:hanging="360"/>
+      </w:pPr>
+    </w:lvl>
+    <w:lvl w:ilvl="8">
+      <w:start w:val="1"/>
+      <w:numFmt w:val="lowerRoman"/>
+      <w:lvlText w:val="%9."/>
+      <w:lvlJc w:val="right"/>
+      <w:pPr>
+        <w:ind w:left="6480" w:hanging="180"/>
+      </w:pPr>
+    </w:lvl>
+  </w:abstractNum>
+  <w:abstractNum w:abstractNumId="2" w15:restartNumberingAfterBreak="0">
     <w:nsid w:val="5FB0257F"/>
     <w:multiLevelType w:val="hybridMultilevel"/>
     <w:tmpl w:val="7BC49C2A"/>
@@ -639,7 +2549,7 @@
       </w:rPr>
     </w:lvl>
   </w:abstractNum>
-  <w:abstractNum w:abstractNumId="1" w15:restartNumberingAfterBreak="0">
+  <w:abstractNum w:abstractNumId="3" w15:restartNumberingAfterBreak="0">
     <w:nsid w:val="69A24357"/>
     <w:multiLevelType w:val="hybridMultilevel"/>
     <w:tmpl w:val="7F566EC2"/>
@@ -753,10 +2663,16 @@
     </w:lvl>
   </w:abstractNum>
   <w:num w:numId="1" w16cid:durableId="1981883319">
-    <w:abstractNumId w:val="0"/>
+    <w:abstractNumId w:val="2"/>
   </w:num>
   <w:num w:numId="2" w16cid:durableId="1448618219">
+    <w:abstractNumId w:val="3"/>
+  </w:num>
+  <w:num w:numId="3" w16cid:durableId="220480934">
     <w:abstractNumId w:val="1"/>
+  </w:num>
+  <w:num w:numId="4" w16cid:durableId="247888798">
+    <w:abstractNumId w:val="0"/>
   </w:num>
 </w:numbering>
 </file>

</xml_diff>